<commit_message>
docs(reports): cost breakdown v2 — blank models recovered via client-event join
9 of 11 blank-model runs ($42.27) now attributed via the same turn's
ai_message_completed model (±3 min person join); 2 aborted runs ($4.34) stay
honestly '(blank)'. Per-turn sheet gains a 'Model source' column
(metered/recovered/lost). Notes cite the root cause filed as jacBuilder #944
(bridge:run TTL-refresh wipes model/byok before mid-turn worker handoff).
Totals unchanged and re-asserted: $351.76 / 230 runs / 44 users.

Co-Authored-By: Claude Fable 5 <noreply@anthropic.com>
Claude-Session: https://claude.ai/code/session_01W9vkoPCLy7yqvHPsZbTQZh
</commit_message>
<xml_diff>
--- a/reports/hackathon-2026-07-26/COST_BREAKDOWN.docx
+++ b/reports/hackathon-2026-07-26/COST_BREAKDOWN.docx
@@ -1654,7 +1654,7 @@
               <w:rPr>
                 <w:sz w:val="17"/>
               </w:rPr>
-              <w:t>(blank)</w:t>
+              <w:t>claude-sonnet-4-6</w:t>
             </w:r>
           </w:p>
         </w:tc>
@@ -4924,7 +4924,7 @@
               <w:rPr>
                 <w:sz w:val="17"/>
               </w:rPr>
-              <w:t>172</w:t>
+              <w:t>178</w:t>
             </w:r>
           </w:p>
         </w:tc>
@@ -4937,7 +4937,7 @@
               <w:rPr>
                 <w:sz w:val="17"/>
               </w:rPr>
-              <w:t>39</w:t>
+              <w:t>40</w:t>
             </w:r>
           </w:p>
         </w:tc>
@@ -4950,7 +4950,7 @@
               <w:rPr>
                 <w:sz w:val="17"/>
               </w:rPr>
-              <w:t>198.17</w:t>
+              <w:t>219.17</w:t>
             </w:r>
           </w:p>
         </w:tc>
@@ -4963,7 +4963,7 @@
               <w:rPr>
                 <w:sz w:val="17"/>
               </w:rPr>
-              <w:t>1.152</w:t>
+              <w:t>1.231</w:t>
             </w:r>
           </w:p>
         </w:tc>
@@ -4991,7 +4991,7 @@
               <w:rPr>
                 <w:sz w:val="17"/>
               </w:rPr>
-              <w:t>38</w:t>
+              <w:t>41</w:t>
             </w:r>
           </w:p>
         </w:tc>
@@ -5017,7 +5017,7 @@
               <w:rPr>
                 <w:sz w:val="17"/>
               </w:rPr>
-              <w:t>102.73</w:t>
+              <w:t>123.99</w:t>
             </w:r>
           </w:p>
         </w:tc>
@@ -5030,7 +5030,7 @@
               <w:rPr>
                 <w:sz w:val="17"/>
               </w:rPr>
-              <w:t>2.703</w:t>
+              <w:t>3.024</w:t>
             </w:r>
           </w:p>
         </w:tc>
@@ -5058,7 +5058,7 @@
               <w:rPr>
                 <w:sz w:val="17"/>
               </w:rPr>
-              <w:t>11</w:t>
+              <w:t>2</w:t>
             </w:r>
           </w:p>
         </w:tc>
@@ -5071,7 +5071,7 @@
               <w:rPr>
                 <w:sz w:val="17"/>
               </w:rPr>
-              <w:t>8</w:t>
+              <w:t>2</w:t>
             </w:r>
           </w:p>
         </w:tc>
@@ -5084,7 +5084,7 @@
               <w:rPr>
                 <w:sz w:val="17"/>
               </w:rPr>
-              <w:t>46.61</w:t>
+              <w:t>4.34</w:t>
             </w:r>
           </w:p>
         </w:tc>
@@ -5097,7 +5097,7 @@
               <w:rPr>
                 <w:sz w:val="17"/>
               </w:rPr>
-              <w:t>4.237</w:t>
+              <w:t>2.169</w:t>
             </w:r>
           </w:p>
         </w:tc>
@@ -5317,7 +5317,7 @@
         <w:pStyle w:val="ListBullet"/>
       </w:pPr>
       <w:r>
-        <w:t>'(blank)' model rows are real spend — $46.61 across 11 runs (8 users) arrived with the model property missing (instrumentation gap, since flagged). The dollars are correct; only the model attribution is missing.</w:t>
+        <w:t>Model attribution: 11 runs originally arrived with the model label lost (long-turn worker-handoff bug in the product backend — filed with full proof as jacBuilder issue #944). 9 of them ($42.27) are attributed here via the same turn's client-side completion event; 2 aborted runs ($4.34) are unrecoverable and shown as (blank). Per-run 'model source' flags are in the spreadsheet.</w:t>
       </w:r>
     </w:p>
     <w:p>
@@ -5351,7 +5351,7 @@
           <w:color w:val="666666"/>
           <w:sz w:val="17"/>
         </w:rPr>
-        <w:t>Validated three ways: raw per-turn reconciliation to the cent; independently rebuilt by the JacHammer Analytics Report Studio with matching numbers; re-verified under the hardened jachammer.ai-only production filter (zero contamination). Generated 2026-07-27 16:30 UTC.</w:t>
+        <w:t>Validated three ways: raw per-turn reconciliation to the cent; independently rebuilt by the JacHammer Analytics Report Studio with matching numbers; re-verified under the hardened jachammer.ai-only production filter (zero contamination). Generated 2026-07-27 16:41 UTC.</w:t>
       </w:r>
     </w:p>
     <w:sectPr>

</xml_diff>

<commit_message>
fix(reports): last stale '00:30 UTC' display label in cost breakdown header
Co-Authored-By: Claude Fable 5 <noreply@anthropic.com>
Claude-Session: https://claude.ai/code/session_01W9vkoPCLy7yqvHPsZbTQZh
</commit_message>
<xml_diff>
--- a/reports/hackathon-2026-07-26/COST_BREAKDOWN.docx
+++ b/reports/hackathon-2026-07-26/COST_BREAKDOWN.docx
@@ -18,7 +18,7 @@
         <w:t xml:space="preserve">Event window: </w:t>
       </w:r>
       <w:r>
-        <w:t>2026-07-26 17:00 → 2026-07-27 00:30 UTC  (= Jul 26 10:30 PM → Jul 27 9:00 AM Sri Lanka time)</w:t>
+        <w:t>2026-07-26 17:00 → 2026-07-27 03:30 UTC  (= Jul 26 10:30 PM → Jul 27 9:00 AM Sri Lanka time)</w:t>
         <w:br/>
       </w:r>
       <w:r>
@@ -6715,7 +6715,7 @@
           <w:color w:val="666666"/>
           <w:sz w:val="17"/>
         </w:rPr>
-        <w:t>Validated three ways: raw per-turn reconciliation to the cent; independently rebuilt by the JacHammer Analytics Report Studio with matching numbers; re-verified under the hardened jachammer.ai-only production filter (zero contamination). Generated 2026-07-28 03:19 UTC.</w:t>
+        <w:t>Validated three ways: raw per-turn reconciliation to the cent; independently rebuilt by the JacHammer Analytics Report Studio with matching numbers; re-verified under the hardened jachammer.ai-only production filter (zero contamination). Generated 2026-07-28 03:30 UTC.</w:t>
       </w:r>
     </w:p>
     <w:sectPr>

</xml_diff>